<commit_message>
Use connection journal for attendance completion and add provider stamp
</commit_message>
<xml_diff>
--- a/templates_word/tableau_suivi_foad_cnaps.docx
+++ b/templates_word/tableau_suivi_foad_cnaps.docx
@@ -116,7 +116,7 @@
                 <w:color w:val="E78B18"/>
                 <w:sz w:val="17"/>
               </w:rPr>
-              <w:t>Bordereau probatoire APS — formation asynchrone</w:t>
+              <w:t>{{ dossier_status }}</w:t>
             </w:r>
           </w:p>
         </w:tc>
@@ -1181,7 +1181,7 @@
         <w:tc>
           <w:tcPr>
             <w:tcW w:type="dxa" w:w="3311999"/>
-            <w:shd w:fill="FFFFFF"/>
+            <w:shd w:fill="FFF4D9"/>
             <w:tcMar>
               <w:top w:w="65" w:type="dxa"/>
               <w:start w:w="100" w:type="dxa"/>
@@ -1207,7 +1207,7 @@
                 <w:color w:val="64748B"/>
                 <w:sz w:val="14"/>
               </w:rPr>
-              <w:t>Durée effectivement suivie</w:t>
+              <w:t>Durée totale de connexion (journal)</w:t>
               <w:br/>
             </w:r>
             <w:r>
@@ -1215,10 +1215,11 @@
                 <w:rFonts w:ascii="DejaVu Sans" w:hAnsi="DejaVu Sans"/>
                 <w:b/>
                 <w:i w:val="0"/>
-                <w:color w:val="172033"/>
-                <w:sz w:val="16"/>
+                <w:color w:val="172D3B"/>
+                <w:sz w:val="24"/>
+                <w:szCs w:val="24"/>
               </w:rPr>
-              <w:t>{{ effective_duration }}</w:t>
+              <w:t>{{ connection_log_total }}</w:t>
             </w:r>
           </w:p>
         </w:tc>
@@ -1227,7 +1228,7 @@
         <w:tc>
           <w:tcPr>
             <w:tcW w:type="dxa" w:w="3311999"/>
-            <w:shd w:fill="F8FAFC"/>
+            <w:shd w:fill="FFF4D9"/>
             <w:tcMar>
               <w:top w:w="65" w:type="dxa"/>
               <w:start w:w="100" w:type="dxa"/>
@@ -1253,7 +1254,7 @@
                 <w:color w:val="64748B"/>
                 <w:sz w:val="14"/>
               </w:rPr>
-              <w:t>Taux de réalisation</w:t>
+              <w:t>Suivi de l’assiduité (seuil &gt; 62 h)</w:t>
               <w:br/>
             </w:r>
             <w:r>
@@ -1261,8 +1262,9 @@
                 <w:rFonts w:ascii="DejaVu Sans" w:hAnsi="DejaVu Sans"/>
                 <w:b/>
                 <w:i w:val="0"/>
-                <w:color w:val="172033"/>
-                <w:sz w:val="16"/>
+                <w:color w:val="172D3B"/>
+                <w:sz w:val="24"/>
+                <w:szCs w:val="24"/>
               </w:rPr>
               <w:t>{{ completion_rate }}</w:t>
             </w:r>
@@ -1297,7 +1299,7 @@
                 <w:color w:val="64748B"/>
                 <w:sz w:val="14"/>
               </w:rPr>
-              <w:t>Connexions — synthèse / journal</w:t>
+              <w:t>Durée pédagogique Digiforma (théorique)</w:t>
               <w:br/>
             </w:r>
             <w:r>
@@ -1308,7 +1310,7 @@
                 <w:color w:val="172033"/>
                 <w:sz w:val="16"/>
               </w:rPr>
-              <w:t>{{ connection_duration }} / {{ connection_log_total }}</w:t>
+              <w:t>{{ pedagogical_duration }}</w:t>
             </w:r>
           </w:p>
         </w:tc>
@@ -1794,7 +1796,7 @@
                 <w:color w:val="172033"/>
                 <w:sz w:val="15"/>
               </w:rPr>
-              <w:t>Horodatages, jours d'accès, durées de connexion et durée effectivement suivie.</w:t>
+              <w:t>Horodatages, jours d'accès et durée totale du journal. Suivi à 100 % uniquement au-delà de 62 h.</w:t>
             </w:r>
           </w:p>
         </w:tc>

</xml_diff>